<commit_message>
fix(dev): pin 127.0.0.1 so a fresh clone does not hit the IPv6 wall
On Windows "localhost" resolves to IPv6 ::1 first while Docker Desktop's port
proxy binds IPv4 only, so every host->container connection is refused. It does
not fail cleanly: the symptoms were 61 pytest errors, API 500s and failed data
exports, none of which name DNS. Confirmed with a raw Postgres SSLRequest --
127.0.0.1 replied, localhost reset the connection.

The local .env was pinned when this was diagnosed, but .env.example and
docker-compose.yml were not, so anyone cloning the repo walked into the same
wall with the same unhelpful symptoms.

Compose now publishes on 127.0.0.1 explicitly rather than the bare "5432:5432"
form, which is also the narrower exposure: bare publishes on 0.0.0.0 and puts
the database on the local network.

Adds the symptom, cause and a discriminating check to the runbook's
troubleshooting table.

Co-Authored-By: Claude Opus 5 <noreply@anthropic.com>
</commit_message>
<xml_diff>
--- a/SportIQ-Local-Setup.docx
+++ b/SportIQ-Local-Setup.docx
@@ -2336,6 +2336,38 @@
           </w:p>
         </w:tc>
       </w:tr>
+      <w:tr>
+        <w:tc>
+          <w:tcPr>
+            <w:tcW w:type="dxa" w:w="2880"/>
+          </w:tcPr>
+          <w:p>
+            <w:r>
+              <w:t>Tests error en masse, API returns 500, or a script cannot reach the DB — yet Docker says the containers are healthy</w:t>
+            </w:r>
+          </w:p>
+        </w:tc>
+        <w:tc>
+          <w:tcPr>
+            <w:tcW w:type="dxa" w:w="2736"/>
+          </w:tcPr>
+          <w:p>
+            <w:r>
+              <w:t>On Windows "localhost" resolves to IPv6 ::1 first, but Docker Desktop's port proxy binds IPv4 only, so the connection is refused. Nothing in the error mentions DNS.</w:t>
+            </w:r>
+          </w:p>
+        </w:tc>
+        <w:tc>
+          <w:tcPr>
+            <w:tcW w:type="dxa" w:w="3456"/>
+          </w:tcPr>
+          <w:p>
+            <w:r>
+              <w:t>Use 127.0.0.1, never localhost, in backend\.env (DATABASE_URL and REDIS_URL). Both .env.example and docker-compose.yml already pin it. To confirm this is the cause, compare a connection to 127.0.0.1:5432 against localhost:5432 — the first replies, the second resets.</w:t>
+            </w:r>
+          </w:p>
+        </w:tc>
+      </w:tr>
     </w:tbl>
     <w:p>
       <w:pPr>

</xml_diff>